<commit_message>
System Test and UAT: Delete in the sale row, and the Sales date limits
System Test: deleting a sale is its own feature, from the trash button in
the sale's row (View no longer has it), and the Sales list adds a From
date before the first sale and a date in the future. UAT: Sales History
Range Check adds the From date before the first sale.
System Test 260 (Administrator 186); UAT Administrator 59, All roles 100.

Co-Authored-By: Claude Opus 5.5 <noreply@anthropic.com>
</commit_message>
<xml_diff>
--- a/QA/FETCH-System-Test-Plan-Administrator.docx
+++ b/QA/FETCH-System-Test-Plan-Administrator.docx
@@ -8329,6 +8329,156 @@
         <w:tc>
           <w:tcPr>
             <w:tcW w:type="dxa" w:w="600"/>
+          </w:tcPr>
+          <w:p/>
+        </w:tc>
+        <w:tc>
+          <w:tcPr>
+            <w:tcW w:type="dxa" w:w="2300"/>
+          </w:tcPr>
+          <w:p/>
+        </w:tc>
+        <w:tc>
+          <w:tcPr>
+            <w:tcW w:type="dxa" w:w="4500"/>
+          </w:tcPr>
+          <w:p>
+            <w:pPr>
+              <w:spacing w:after="0"/>
+            </w:pPr>
+            <w:r/>
+            <w:r>
+              <w:rPr>
+                <w:rFonts w:ascii="Calibri" w:hAnsi="Calibri"/>
+                <w:sz w:val="21"/>
+              </w:rPr>
+              <w:t>Check if the From date is before the first sale: type a From date before the first sale recorded in FETCH, then click the "Filter" button</w:t>
+            </w:r>
+          </w:p>
+        </w:tc>
+        <w:tc>
+          <w:tcPr>
+            <w:tcW w:type="dxa" w:w="4700"/>
+          </w:tcPr>
+          <w:p>
+            <w:pPr>
+              <w:spacing w:after="0"/>
+            </w:pPr>
+            <w:r/>
+            <w:r>
+              <w:rPr>
+                <w:rFonts w:ascii="Calibri" w:hAnsi="Calibri"/>
+                <w:sz w:val="21"/>
+              </w:rPr>
+              <w:t>"The first sale in FETCH was on (date). Choose that day or later." appears and the list does not change</w:t>
+            </w:r>
+          </w:p>
+        </w:tc>
+        <w:tc>
+          <w:tcPr>
+            <w:tcW w:type="dxa" w:w="2100"/>
+          </w:tcPr>
+          <w:p/>
+        </w:tc>
+        <w:tc>
+          <w:tcPr>
+            <w:tcW w:type="dxa" w:w="1520"/>
+          </w:tcPr>
+          <w:p/>
+        </w:tc>
+        <w:tc>
+          <w:tcPr>
+            <w:tcW w:type="dxa" w:w="1100"/>
+          </w:tcPr>
+          <w:p/>
+        </w:tc>
+      </w:tr>
+      <w:tr>
+        <w:tc>
+          <w:tcPr>
+            <w:tcW w:type="dxa" w:w="1900"/>
+            <w:vMerge/>
+          </w:tcPr>
+          <w:p/>
+        </w:tc>
+        <w:tc>
+          <w:tcPr>
+            <w:tcW w:type="dxa" w:w="600"/>
+          </w:tcPr>
+          <w:p/>
+        </w:tc>
+        <w:tc>
+          <w:tcPr>
+            <w:tcW w:type="dxa" w:w="2300"/>
+          </w:tcPr>
+          <w:p/>
+        </w:tc>
+        <w:tc>
+          <w:tcPr>
+            <w:tcW w:type="dxa" w:w="4500"/>
+          </w:tcPr>
+          <w:p>
+            <w:pPr>
+              <w:spacing w:after="0"/>
+            </w:pPr>
+            <w:r/>
+            <w:r>
+              <w:rPr>
+                <w:rFonts w:ascii="Calibri" w:hAnsi="Calibri"/>
+                <w:sz w:val="21"/>
+              </w:rPr>
+              <w:t>Check if the date is in the future: type a To date after today, then click the "Filter" button</w:t>
+            </w:r>
+          </w:p>
+        </w:tc>
+        <w:tc>
+          <w:tcPr>
+            <w:tcW w:type="dxa" w:w="4700"/>
+          </w:tcPr>
+          <w:p>
+            <w:pPr>
+              <w:spacing w:after="0"/>
+            </w:pPr>
+            <w:r/>
+            <w:r>
+              <w:rPr>
+                <w:rFonts w:ascii="Calibri" w:hAnsi="Calibri"/>
+                <w:sz w:val="21"/>
+              </w:rPr>
+              <w:t>"Choose today or an earlier date: there are no sales in the future." appears and the list does not change</w:t>
+            </w:r>
+          </w:p>
+        </w:tc>
+        <w:tc>
+          <w:tcPr>
+            <w:tcW w:type="dxa" w:w="2100"/>
+          </w:tcPr>
+          <w:p/>
+        </w:tc>
+        <w:tc>
+          <w:tcPr>
+            <w:tcW w:type="dxa" w:w="1520"/>
+          </w:tcPr>
+          <w:p/>
+        </w:tc>
+        <w:tc>
+          <w:tcPr>
+            <w:tcW w:type="dxa" w:w="1100"/>
+          </w:tcPr>
+          <w:p/>
+        </w:tc>
+      </w:tr>
+      <w:tr>
+        <w:tc>
+          <w:tcPr>
+            <w:tcW w:type="dxa" w:w="1900"/>
+            <w:vMerge/>
+          </w:tcPr>
+          <w:p/>
+        </w:tc>
+        <w:tc>
+          <w:tcPr>
+            <w:tcW w:type="dxa" w:w="600"/>
             <w:shd w:val="clear" w:color="auto" w:fill="D0CECE"/>
           </w:tcPr>
           <w:p>
@@ -8453,7 +8603,7 @@
                 <w:rFonts w:ascii="Calibri" w:hAnsi="Calibri"/>
                 <w:sz w:val="21"/>
               </w:rPr>
-              <w:t>The Sale Details window opens with the items, totals, cashier and payment</w:t>
+              <w:t>The Sale Details window opens with the items, totals, cashier and payment, and the "Close" and "Print receipt" buttons</w:t>
             </w:r>
           </w:p>
         </w:tc>
@@ -8585,7 +8735,7 @@
                 <w:rFonts w:ascii="Calibri" w:hAnsi="Calibri"/>
                 <w:sz w:val="21"/>
               </w:rPr>
-              <w:t>Check if a sale is deleted: click the "Delete sale" button, then the "Yes, Delete" button</w:t>
+              <w:t>Check if the window closes: click the "Close" button</w:t>
             </w:r>
           </w:p>
         </w:tc>
@@ -8603,7 +8753,7 @@
                 <w:rFonts w:ascii="Calibri" w:hAnsi="Calibri"/>
                 <w:sz w:val="21"/>
               </w:rPr>
-              <w:t>"Sale deleted" appears and the sale leaves the list</w:t>
+              <w:t>The window closes. Sales shows again</w:t>
             </w:r>
           </w:p>
         </w:tc>
@@ -8637,66 +8787,74 @@
         <w:tc>
           <w:tcPr>
             <w:tcW w:type="dxa" w:w="600"/>
-          </w:tcPr>
-          <w:p/>
+            <w:shd w:val="clear" w:color="auto" w:fill="D0CECE"/>
+          </w:tcPr>
+          <w:p>
+            <w:pPr>
+              <w:spacing w:after="0"/>
+              <w:jc w:val="right"/>
+            </w:pPr>
+            <w:r/>
+            <w:r>
+              <w:rPr>
+                <w:rFonts w:ascii="Calibri" w:hAnsi="Calibri"/>
+                <w:sz w:val="21"/>
+              </w:rPr>
+              <w:t>3</w:t>
+            </w:r>
+          </w:p>
         </w:tc>
         <w:tc>
           <w:tcPr>
             <w:tcW w:type="dxa" w:w="2300"/>
-          </w:tcPr>
-          <w:p/>
+            <w:shd w:val="clear" w:color="auto" w:fill="D0CECE"/>
+          </w:tcPr>
+          <w:p>
+            <w:pPr>
+              <w:spacing w:after="0"/>
+            </w:pPr>
+            <w:r/>
+            <w:r>
+              <w:rPr>
+                <w:rFonts w:ascii="Calibri" w:hAnsi="Calibri"/>
+                <w:sz w:val="21"/>
+              </w:rPr>
+              <w:t>Delete a sale</w:t>
+            </w:r>
+          </w:p>
         </w:tc>
         <w:tc>
           <w:tcPr>
             <w:tcW w:type="dxa" w:w="4500"/>
-          </w:tcPr>
-          <w:p>
-            <w:pPr>
-              <w:spacing w:after="0"/>
-            </w:pPr>
-            <w:r/>
-            <w:r>
-              <w:rPr>
-                <w:rFonts w:ascii="Calibri" w:hAnsi="Calibri"/>
-                <w:sz w:val="21"/>
-              </w:rPr>
-              <w:t>Check if deleting can be cancelled: click the "Delete sale" button, then the "Cancel" button</w:t>
-            </w:r>
-          </w:p>
+            <w:shd w:val="clear" w:color="auto" w:fill="D0CECE"/>
+          </w:tcPr>
+          <w:p/>
         </w:tc>
         <w:tc>
           <w:tcPr>
             <w:tcW w:type="dxa" w:w="4700"/>
-          </w:tcPr>
-          <w:p>
-            <w:pPr>
-              <w:spacing w:after="0"/>
-            </w:pPr>
-            <w:r/>
-            <w:r>
-              <w:rPr>
-                <w:rFonts w:ascii="Calibri" w:hAnsi="Calibri"/>
-                <w:sz w:val="21"/>
-              </w:rPr>
-              <w:t>The confirmation box closes. The sale stays</w:t>
-            </w:r>
-          </w:p>
+            <w:shd w:val="clear" w:color="auto" w:fill="D0CECE"/>
+          </w:tcPr>
+          <w:p/>
         </w:tc>
         <w:tc>
           <w:tcPr>
             <w:tcW w:type="dxa" w:w="2100"/>
+            <w:shd w:val="clear" w:color="auto" w:fill="D0CECE"/>
           </w:tcPr>
           <w:p/>
         </w:tc>
         <w:tc>
           <w:tcPr>
             <w:tcW w:type="dxa" w:w="1520"/>
+            <w:shd w:val="clear" w:color="auto" w:fill="D0CECE"/>
           </w:tcPr>
           <w:p/>
         </w:tc>
         <w:tc>
           <w:tcPr>
             <w:tcW w:type="dxa" w:w="1100"/>
+            <w:shd w:val="clear" w:color="auto" w:fill="D0CECE"/>
           </w:tcPr>
           <w:p/>
         </w:tc>
@@ -8735,7 +8893,7 @@
                 <w:rFonts w:ascii="Calibri" w:hAnsi="Calibri"/>
                 <w:sz w:val="21"/>
               </w:rPr>
-              <w:t>Check if the window closes: click the "Close" button</w:t>
+              <w:t>Check if a sale is deleted: click the trash (Delete) button in a sale's row, then the "Yes, Delete" button</w:t>
             </w:r>
           </w:p>
         </w:tc>
@@ -8753,7 +8911,7 @@
                 <w:rFonts w:ascii="Calibri" w:hAnsi="Calibri"/>
                 <w:sz w:val="21"/>
               </w:rPr>
-              <w:t>The window closes. Sales shows again</w:t>
+              <w:t>The question explains that Void keeps the sale on record. After "Yes, Delete", "Sale deleted" appears and the sale leaves the list</w:t>
             </w:r>
           </w:p>
         </w:tc>
@@ -8787,6 +8945,81 @@
         <w:tc>
           <w:tcPr>
             <w:tcW w:type="dxa" w:w="600"/>
+          </w:tcPr>
+          <w:p/>
+        </w:tc>
+        <w:tc>
+          <w:tcPr>
+            <w:tcW w:type="dxa" w:w="2300"/>
+          </w:tcPr>
+          <w:p/>
+        </w:tc>
+        <w:tc>
+          <w:tcPr>
+            <w:tcW w:type="dxa" w:w="4500"/>
+          </w:tcPr>
+          <w:p>
+            <w:pPr>
+              <w:spacing w:after="0"/>
+            </w:pPr>
+            <w:r/>
+            <w:r>
+              <w:rPr>
+                <w:rFonts w:ascii="Calibri" w:hAnsi="Calibri"/>
+                <w:sz w:val="21"/>
+              </w:rPr>
+              <w:t>Check if deleting can be cancelled: click the trash (Delete) button in a sale's row, then the "Cancel" button</w:t>
+            </w:r>
+          </w:p>
+        </w:tc>
+        <w:tc>
+          <w:tcPr>
+            <w:tcW w:type="dxa" w:w="4700"/>
+          </w:tcPr>
+          <w:p>
+            <w:pPr>
+              <w:spacing w:after="0"/>
+            </w:pPr>
+            <w:r/>
+            <w:r>
+              <w:rPr>
+                <w:rFonts w:ascii="Calibri" w:hAnsi="Calibri"/>
+                <w:sz w:val="21"/>
+              </w:rPr>
+              <w:t>The confirmation box closes. The sale stays</w:t>
+            </w:r>
+          </w:p>
+        </w:tc>
+        <w:tc>
+          <w:tcPr>
+            <w:tcW w:type="dxa" w:w="2100"/>
+          </w:tcPr>
+          <w:p/>
+        </w:tc>
+        <w:tc>
+          <w:tcPr>
+            <w:tcW w:type="dxa" w:w="1520"/>
+          </w:tcPr>
+          <w:p/>
+        </w:tc>
+        <w:tc>
+          <w:tcPr>
+            <w:tcW w:type="dxa" w:w="1100"/>
+          </w:tcPr>
+          <w:p/>
+        </w:tc>
+      </w:tr>
+      <w:tr>
+        <w:tc>
+          <w:tcPr>
+            <w:tcW w:type="dxa" w:w="1900"/>
+            <w:vMerge/>
+          </w:tcPr>
+          <w:p/>
+        </w:tc>
+        <w:tc>
+          <w:tcPr>
+            <w:tcW w:type="dxa" w:w="600"/>
             <w:shd w:val="clear" w:color="auto" w:fill="D0CECE"/>
           </w:tcPr>
           <w:p>
@@ -8800,7 +9033,7 @@
                 <w:rFonts w:ascii="Calibri" w:hAnsi="Calibri"/>
                 <w:sz w:val="21"/>
               </w:rPr>
-              <w:t>3</w:t>
+              <w:t>4</w:t>
             </w:r>
           </w:p>
         </w:tc>
@@ -9108,7 +9341,7 @@
                 <w:rFonts w:ascii="Calibri" w:hAnsi="Calibri"/>
                 <w:sz w:val="21"/>
               </w:rPr>
-              <w:t>4</w:t>
+              <w:t>5</w:t>
             </w:r>
           </w:p>
         </w:tc>
@@ -9341,7 +9574,7 @@
                 <w:rFonts w:ascii="Calibri" w:hAnsi="Calibri"/>
                 <w:sz w:val="21"/>
               </w:rPr>
-              <w:t>5</w:t>
+              <w:t>6</w:t>
             </w:r>
           </w:p>
         </w:tc>

</xml_diff>

<commit_message>
Test documents: the Sales exports are Excel files
System Test and Unit Test: the Sales and Sales report export steps press
Export Excel and expect an .xlsx table with a TOTAL row (voided sales
left out of the Sales total). Import CSV and the reorder list stay CSV.
The UAT had no Sales export test; the light/dark button steps stand, as
the button is back in the sidebar.

Co-Authored-By: Claude Opus 5.5 <noreply@anthropic.com>
</commit_message>
<xml_diff>
--- a/QA/FETCH-System-Test-Plan-Administrator.docx
+++ b/QA/FETCH-System-Test-Plan-Administrator.docx
@@ -26498,7 +26498,7 @@
                 <w:sz w:val="16"/>
                 <w:szCs w:val="16"/>
               </w:rPr>
-              <w:t>Click the "Export CSV" button</w:t>
+              <w:t>Click the "Export Excel" button</w:t>
             </w:r>
           </w:p>
         </w:tc>
@@ -26531,7 +26531,7 @@
                 <w:sz w:val="16"/>
                 <w:szCs w:val="16"/>
               </w:rPr>
-              <w:t>The CSV file is saved and "Sales exported successfully" appears</w:t>
+              <w:t>An Excel file (.xlsx) is saved with the sales in a table and a TOTAL row, and "Sales exported successfully" appears</w:t>
             </w:r>
           </w:p>
         </w:tc>
@@ -26798,7 +26798,7 @@
                 <w:sz w:val="16"/>
                 <w:szCs w:val="16"/>
               </w:rPr>
-              <w:t>Filter to dates with no sales, then click the "Export CSV" button</w:t>
+              <w:t>Filter to dates with no sales, then click the "Export Excel" button</w:t>
             </w:r>
           </w:p>
         </w:tc>
@@ -37014,7 +37014,7 @@
                 <w:sz w:val="16"/>
                 <w:szCs w:val="16"/>
               </w:rPr>
-              <w:t>Click the "Export CSV" button</w:t>
+              <w:t>Click the "Export Excel" button</w:t>
             </w:r>
           </w:p>
         </w:tc>
@@ -37047,7 +37047,7 @@
                 <w:sz w:val="16"/>
                 <w:szCs w:val="16"/>
               </w:rPr>
-              <w:t>The report is saved and "Sales report exported" appears</w:t>
+              <w:t>The report is saved as an Excel file (.xlsx) with a TOTAL row, and "Sales report exported" appears</w:t>
             </w:r>
           </w:p>
         </w:tc>
@@ -37914,7 +37914,7 @@
                 <w:sz w:val="16"/>
                 <w:szCs w:val="16"/>
               </w:rPr>
-              <w:t>Choose a period with no sales, then click the "Export CSV" button</w:t>
+              <w:t>Choose a period with no sales, then click the "Export Excel" button</w:t>
             </w:r>
           </w:p>
         </w:tc>

</xml_diff>